<commit_message>
docs & arch: add Mini-ERP model architecture and update academic Word report
- Add docs/diagrams/ERP_Model_Architecture.svg (5 core ERP modules)
- Update docs/BAO_CAO_DO_AN_IE103.docx (complete, concise, structured UIT Word report)
- Update docs/BAO_CAO_DO_AN_IE103.md and README.md with ERP analysis and optimal tech stack guidance
</commit_message>
<xml_diff>
--- a/docs/BAO_CAO_DO_AN_IE103.docx
+++ b/docs/BAO_CAO_DO_AN_IE103.docx
@@ -23,7 +23,7 @@
           <w:rFonts w:ascii="Times New Roman" w:hAnsi="Times New Roman"/>
           <w:b/>
           <w:color w:val="4B5563"/>
-          <w:sz w:val="28"/>
+          <w:sz w:val="27"/>
         </w:rPr>
         <w:t>KHOA HỆ THỐNG THÔNG TIN</w:t>
         <w:br/>
@@ -65,7 +65,7 @@
           <w:rFonts w:ascii="Times New Roman" w:hAnsi="Times New Roman"/>
           <w:b/>
           <w:color w:val="964B00"/>
-          <w:sz w:val="44"/>
+          <w:sz w:val="42"/>
         </w:rPr>
         <w:t>HỆ THỐNG QUẢN LÝ CỬA HÀNG CÀ PHÊ / TRÀ SỮA</w:t>
         <w:br/>
@@ -85,7 +85,7 @@
     </w:p>
     <w:p>
       <w:pPr>
-        <w:spacing w:line="360" w:lineRule="auto"/>
+        <w:spacing w:line="336" w:lineRule="auto"/>
         <w:ind w:left="2160"/>
       </w:pPr>
       <w:r>
@@ -167,7 +167,7 @@
           <w:rFonts w:ascii="Times New Roman" w:hAnsi="Times New Roman"/>
           <w:b/>
           <w:color w:val="78350F"/>
-          <w:sz w:val="32"/>
+          <w:sz w:val="30"/>
         </w:rPr>
         <w:t>LỜI NÓI ĐẦU</w:t>
       </w:r>
@@ -183,7 +183,7 @@
           <w:rFonts w:ascii="Times New Roman" w:hAnsi="Times New Roman"/>
           <w:sz w:val="26"/>
         </w:rPr>
-        <w:t>Trong bối cảnh nền kinh tế số và sự phát triển vượt bậc của ngành dịch vụ ăn uống và giải khát (F&amp;B) tại Việt Nam, các mô hình chuỗi cửa hàng cà phê và trà sữa đang ngày càng mở rộng với tốc độ nhanh chóng. Đặc thù của ngành kinh doanh đồ uống là các món thức uống được pha chế tại quầy từ nhiều loại nguyên liệu thô khác nhau theo công thức định lượng (Recipe), đồng thời phục vụ theo nhiều kích cỡ ly (Size S, M, L) và yêu cầu tùy biến của khách hàng (lượng đường, lượng đá, topping).</w:t>
+        <w:t>Ngành dịch vụ ăn uống và giải khát (F&amp;B) tại Việt Nam đang có những bước tiến vượt bậc với sự mở rộng nhanh chóng của các chuỗi cà phê và trà sữa hiện đại. Điểm mấu chốt quyết định sự thành công và phát triển bền vững của một cửa hàng đồ uống không chỉ dừng lại ở chất lượng sản phẩm hay vị trí mặt bằng, mà nằm ở năng lực quản trị thông tin chính xác: từ việc quản lý thực đơn theo kích cỡ ly (Size), tính toán và in hóa đơn thanh toán tốc độ cao tại quầy, cho đến bài toán nan giải nhất là kiểm soát chặt chẽ tỷ lệ tiêu hao nguyên liệu thô theo công thức định lượng (Recipe).</w:t>
       </w:r>
     </w:p>
     <w:p>
@@ -197,7 +197,112 @@
           <w:rFonts w:ascii="Times New Roman" w:hAnsi="Times New Roman"/>
           <w:sz w:val="26"/>
         </w:rPr>
-        <w:t>Nếu không có một hệ thống thông tin quản lý chuẩn mực, người quản lý sẽ đối mặt với tình trạng thất thoát nguyên liệu nghiêm trọng, đứt gãy nguồn cung giữa giờ cao điểm và sai lệch số liệu doanh thu. Đồ án môn học Quản lý Thông tin (IE103) với Đề tài số 2: 'Hệ thống Quản lý Cửa hàng Cà phê / Trà sữa' được xây dựng nhằm giải quyết triệt để các bài toán thực tế trên thông qua việc thiết kế CSDL quan hệ đạt chuẩn 3NF, cài đặt Trigger tự động trừ tồn kho nguyên liệu khi bán hàng, Function tính doanh thu ngày/tháng, cơ chế phân quyền Quản lý và Thu ngân, cùng mẫu hóa đơn Crystal Report chuẩn POS 80mm.</w:t>
+        <w:t>Xuất phát từ yêu cầu thực tiễn và bám sát đề cương đồ án môn học Quản lý Thông tin (IE103) tại Trường Đại học Công nghệ Thông tin - ĐHQG TP.HCM, nhóm chúng em đã lựa chọn thực hiện Đề tài số 2: 'Hệ thống Quản lý Cửa hàng Cà phê / Trà sữa'. Đồ án tập trung giải quyết trọn vẹn 5 yêu cầu kỹ thuật trọng điểm:</w:t>
+      </w:r>
+    </w:p>
+    <w:p>
+      <w:pPr>
+        <w:pStyle w:val="ListBullet"/>
+        <w:spacing w:after="80" w:line="300" w:lineRule="auto"/>
+      </w:pPr>
+      <w:r>
+        <w:rPr>
+          <w:rFonts w:ascii="Times New Roman" w:hAnsi="Times New Roman"/>
+          <w:b/>
+          <w:sz w:val="26"/>
+        </w:rPr>
+        <w:t xml:space="preserve">1. </w:t>
+      </w:r>
+      <w:r>
+        <w:rPr>
+          <w:rFonts w:ascii="Times New Roman" w:hAnsi="Times New Roman"/>
+          <w:sz w:val="26"/>
+        </w:rPr>
+        <w:t>Quản lý danh mục món ăn/đồ uống theo kích cỡ ly (Size S, M, L) và quản lý chi tiết hóa đơn bán hàng.</w:t>
+      </w:r>
+    </w:p>
+    <w:p>
+      <w:pPr>
+        <w:pStyle w:val="ListBullet"/>
+        <w:spacing w:after="80" w:line="300" w:lineRule="auto"/>
+      </w:pPr>
+      <w:r>
+        <w:rPr>
+          <w:rFonts w:ascii="Times New Roman" w:hAnsi="Times New Roman"/>
+          <w:b/>
+          <w:sz w:val="26"/>
+        </w:rPr>
+        <w:t xml:space="preserve">2. </w:t>
+      </w:r>
+      <w:r>
+        <w:rPr>
+          <w:rFonts w:ascii="Times New Roman" w:hAnsi="Times New Roman"/>
+          <w:sz w:val="26"/>
+        </w:rPr>
+        <w:t>Cài đặt Trigger tự động trừ tồn kho nguyên liệu khi bán hàng dựa trên công thức định lượng pha chế; tích hợp cơ chế ném lỗi (RAISERROR) và hủy giao tác (ROLLBACK TRANSACTION) nếu nguyên liệu trong kho không đáp ứng đủ.</w:t>
+      </w:r>
+    </w:p>
+    <w:p>
+      <w:pPr>
+        <w:pStyle w:val="ListBullet"/>
+        <w:spacing w:after="80" w:line="300" w:lineRule="auto"/>
+      </w:pPr>
+      <w:r>
+        <w:rPr>
+          <w:rFonts w:ascii="Times New Roman" w:hAnsi="Times New Roman"/>
+          <w:b/>
+          <w:sz w:val="26"/>
+        </w:rPr>
+        <w:t xml:space="preserve">3. </w:t>
+      </w:r>
+      <w:r>
+        <w:rPr>
+          <w:rFonts w:ascii="Times New Roman" w:hAnsi="Times New Roman"/>
+          <w:sz w:val="26"/>
+        </w:rPr>
+        <w:t>Cài đặt các User-Defined Functions (UDF) tính toán chính xác tổng doanh thu theo ngày và theo tháng/năm.</w:t>
+      </w:r>
+    </w:p>
+    <w:p>
+      <w:pPr>
+        <w:pStyle w:val="ListBullet"/>
+        <w:spacing w:after="80" w:line="300" w:lineRule="auto"/>
+      </w:pPr>
+      <w:r>
+        <w:rPr>
+          <w:rFonts w:ascii="Times New Roman" w:hAnsi="Times New Roman"/>
+          <w:b/>
+          <w:sz w:val="26"/>
+        </w:rPr>
+        <w:t xml:space="preserve">4. </w:t>
+      </w:r>
+      <w:r>
+        <w:rPr>
+          <w:rFonts w:ascii="Times New Roman" w:hAnsi="Times New Roman"/>
+          <w:sz w:val="26"/>
+        </w:rPr>
+        <w:t>Phân quyền bảo mật chặt chẽ giữa 2 nhóm tác nhân: Quản lý (Manager) và Nhân viên Thu ngân (Cashier).</w:t>
+      </w:r>
+    </w:p>
+    <w:p>
+      <w:pPr>
+        <w:pStyle w:val="ListBullet"/>
+        <w:spacing w:after="80" w:line="300" w:lineRule="auto"/>
+      </w:pPr>
+      <w:r>
+        <w:rPr>
+          <w:rFonts w:ascii="Times New Roman" w:hAnsi="Times New Roman"/>
+          <w:b/>
+          <w:sz w:val="26"/>
+        </w:rPr>
+        <w:t xml:space="preserve">5. </w:t>
+      </w:r>
+      <w:r>
+        <w:rPr>
+          <w:rFonts w:ascii="Times New Roman" w:hAnsi="Times New Roman"/>
+          <w:sz w:val="26"/>
+        </w:rPr>
+        <w:t>Xuất mẫu Crystal Report / Hóa đơn thanh toán in nhiệt khổ 80mm tích hợp mã chuyển khoản tự động VietQR.</w:t>
       </w:r>
     </w:p>
     <w:p>
@@ -210,14 +315,14 @@
           <w:rFonts w:ascii="Times New Roman" w:hAnsi="Times New Roman"/>
           <w:b/>
           <w:color w:val="78350F"/>
-          <w:sz w:val="32"/>
+          <w:sz w:val="30"/>
         </w:rPr>
         <w:t>MỤC LỤC TỔNG QUAN</w:t>
       </w:r>
     </w:p>
     <w:p>
       <w:pPr>
-        <w:spacing w:after="60" w:line="276" w:lineRule="auto"/>
+        <w:spacing w:after="50" w:line="276" w:lineRule="auto"/>
       </w:pPr>
       <w:r>
         <w:rPr>
@@ -229,7 +334,7 @@
     </w:p>
     <w:p>
       <w:pPr>
-        <w:spacing w:after="60" w:line="276" w:lineRule="auto"/>
+        <w:spacing w:after="50" w:line="276" w:lineRule="auto"/>
       </w:pPr>
       <w:r>
         <w:t xml:space="preserve">   1.1. Đặt vấn đề và tính cấp thiết của đề tài</w:t>
@@ -237,7 +342,7 @@
     </w:p>
     <w:p>
       <w:pPr>
-        <w:spacing w:after="60" w:line="276" w:lineRule="auto"/>
+        <w:spacing w:after="50" w:line="276" w:lineRule="auto"/>
       </w:pPr>
       <w:r>
         <w:t xml:space="preserve">   1.2. Mục tiêu nghiên cứu và phạm vi ứng dụng</w:t>
@@ -245,7 +350,7 @@
     </w:p>
     <w:p>
       <w:pPr>
-        <w:spacing w:after="60" w:line="276" w:lineRule="auto"/>
+        <w:spacing w:after="50" w:line="276" w:lineRule="auto"/>
       </w:pPr>
       <w:r>
         <w:t xml:space="preserve">   1.3. Khảo sát quy trình nghiệp vụ cửa hàng Cà phê / Trà sữa</w:t>
@@ -253,7 +358,7 @@
     </w:p>
     <w:p>
       <w:pPr>
-        <w:spacing w:after="60" w:line="276" w:lineRule="auto"/>
+        <w:spacing w:after="50" w:line="276" w:lineRule="auto"/>
       </w:pPr>
       <w:r>
         <w:t xml:space="preserve">   1.4. Bảng đối chiếu yêu cầu kỹ thuật đề tài môn học IE103</w:t>
@@ -261,7 +366,7 @@
     </w:p>
     <w:p>
       <w:pPr>
-        <w:spacing w:after="60" w:line="276" w:lineRule="auto"/>
+        <w:spacing w:after="50" w:line="276" w:lineRule="auto"/>
       </w:pPr>
       <w:r>
         <w:rPr>
@@ -273,47 +378,55 @@
     </w:p>
     <w:p>
       <w:pPr>
-        <w:spacing w:after="60" w:line="276" w:lineRule="auto"/>
+        <w:spacing w:after="50" w:line="276" w:lineRule="auto"/>
       </w:pPr>
       <w:r>
-        <w:t xml:space="preserve">   2.1. Biểu đồ Use Case và phân quyền hệ thống (Quản lý vs Thu ngân)</w:t>
+        <w:t xml:space="preserve">   2.1. Phân tích mô hình Mini-ERP chuyên sâu cho chuỗi F&amp;B</w:t>
       </w:r>
     </w:p>
     <w:p>
       <w:pPr>
-        <w:spacing w:after="60" w:line="276" w:lineRule="auto"/>
+        <w:spacing w:after="50" w:line="276" w:lineRule="auto"/>
       </w:pPr>
       <w:r>
-        <w:t xml:space="preserve">   2.2. Sơ đồ quy trình nghiệp vụ trừ kho tự động khi bán hàng</w:t>
+        <w:t xml:space="preserve">   2.2. Biểu đồ Use Case và phân quyền hệ thống (Quản lý vs Thu ngân)</w:t>
       </w:r>
     </w:p>
     <w:p>
       <w:pPr>
-        <w:spacing w:after="60" w:line="276" w:lineRule="auto"/>
+        <w:spacing w:after="50" w:line="276" w:lineRule="auto"/>
       </w:pPr>
       <w:r>
-        <w:t xml:space="preserve">   2.3. Mô hình Thực thể Kết hợp (ERD - Conceptual &amp; Logical)</w:t>
+        <w:t xml:space="preserve">   2.3. Sơ đồ quy trình nghiệp vụ trừ kho tự động khi bán hàng</w:t>
       </w:r>
     </w:p>
     <w:p>
       <w:pPr>
-        <w:spacing w:after="60" w:line="276" w:lineRule="auto"/>
+        <w:spacing w:after="50" w:line="276" w:lineRule="auto"/>
       </w:pPr>
       <w:r>
-        <w:t xml:space="preserve">   2.4. Chuyển đổi sang Mô hình Quan hệ và Chuẩn hóa 3NF</w:t>
+        <w:t xml:space="preserve">   2.4. Mô hình Thực thể Kết hợp (ERD - Conceptual &amp; Logical)</w:t>
       </w:r>
     </w:p>
     <w:p>
       <w:pPr>
-        <w:spacing w:after="60" w:line="276" w:lineRule="auto"/>
+        <w:spacing w:after="50" w:line="276" w:lineRule="auto"/>
       </w:pPr>
       <w:r>
-        <w:t xml:space="preserve">   2.5. Từ điển dữ liệu chi tiết (Data Dictionary - 15 Bảng)</w:t>
+        <w:t xml:space="preserve">   2.5. Chuyển đổi sang Mô hình Quan hệ và Chuẩn hóa 3NF</w:t>
       </w:r>
     </w:p>
     <w:p>
       <w:pPr>
-        <w:spacing w:after="60" w:line="276" w:lineRule="auto"/>
+        <w:spacing w:after="50" w:line="276" w:lineRule="auto"/>
+      </w:pPr>
+      <w:r>
+        <w:t xml:space="preserve">   2.6. Từ điển dữ liệu chi tiết (Data Dictionary - 15 Bảng)</w:t>
+      </w:r>
+    </w:p>
+    <w:p>
+      <w:pPr>
+        <w:spacing w:after="50" w:line="276" w:lineRule="auto"/>
       </w:pPr>
       <w:r>
         <w:rPr>
@@ -325,7 +438,7 @@
     </w:p>
     <w:p>
       <w:pPr>
-        <w:spacing w:after="60" w:line="276" w:lineRule="auto"/>
+        <w:spacing w:after="50" w:line="276" w:lineRule="auto"/>
       </w:pPr>
       <w:r>
         <w:t xml:space="preserve">   3.1. Thiết kế Bảng, Khóa chính, Khóa ngoại và Chỉ mục tối ưu</w:t>
@@ -333,7 +446,7 @@
     </w:p>
     <w:p>
       <w:pPr>
-        <w:spacing w:after="60" w:line="276" w:lineRule="auto"/>
+        <w:spacing w:after="50" w:line="276" w:lineRule="auto"/>
       </w:pPr>
       <w:r>
         <w:t xml:space="preserve">   3.2. Cài đặt các Ràng buộc toàn vẹn (CHECK, UNIQUE, DEFAULT)</w:t>
@@ -341,7 +454,7 @@
     </w:p>
     <w:p>
       <w:pPr>
-        <w:spacing w:after="60" w:line="276" w:lineRule="auto"/>
+        <w:spacing w:after="50" w:line="276" w:lineRule="auto"/>
       </w:pPr>
       <w:r>
         <w:t xml:space="preserve">   3.3. Cài đặt TRIGGER cốt lõi: Tự động trừ tồn kho nguyên liệu khi bán hàng</w:t>
@@ -349,7 +462,7 @@
     </w:p>
     <w:p>
       <w:pPr>
-        <w:spacing w:after="60" w:line="276" w:lineRule="auto"/>
+        <w:spacing w:after="50" w:line="276" w:lineRule="auto"/>
       </w:pPr>
       <w:r>
         <w:t xml:space="preserve">   3.4. Cài đặt TRIGGER phụ trợ: Hoàn kho khi hủy đơn, tính tổng tiền hóa đơn</w:t>
@@ -357,7 +470,7 @@
     </w:p>
     <w:p>
       <w:pPr>
-        <w:spacing w:after="60" w:line="276" w:lineRule="auto"/>
+        <w:spacing w:after="50" w:line="276" w:lineRule="auto"/>
       </w:pPr>
       <w:r>
         <w:t xml:space="preserve">   3.5. Cài đặt FUNCTIONS: Tính tổng doanh thu theo ngày và theo tháng/năm</w:t>
@@ -365,7 +478,7 @@
     </w:p>
     <w:p>
       <w:pPr>
-        <w:spacing w:after="60" w:line="276" w:lineRule="auto"/>
+        <w:spacing w:after="50" w:line="276" w:lineRule="auto"/>
       </w:pPr>
       <w:r>
         <w:t xml:space="preserve">   3.6. Cài đặt STORED PROCEDURES: Giao tác bán hàng, nhập kho, báo cáo</w:t>
@@ -373,7 +486,7 @@
     </w:p>
     <w:p>
       <w:pPr>
-        <w:spacing w:after="60" w:line="276" w:lineRule="auto"/>
+        <w:spacing w:after="50" w:line="276" w:lineRule="auto"/>
       </w:pPr>
       <w:r>
         <w:rPr>
@@ -385,55 +498,63 @@
     </w:p>
     <w:p>
       <w:pPr>
-        <w:spacing w:after="60" w:line="276" w:lineRule="auto"/>
+        <w:spacing w:after="50" w:line="276" w:lineRule="auto"/>
       </w:pPr>
       <w:r>
-        <w:t xml:space="preserve">   4.1. Kiến trúc phân tầng hệ thống (3-Tier Architecture)</w:t>
+        <w:t xml:space="preserve">   4.1. Lựa chọn công nghệ phù hợp nhất cho hệ thống</w:t>
       </w:r>
     </w:p>
     <w:p>
       <w:pPr>
-        <w:spacing w:after="60" w:line="276" w:lineRule="auto"/>
+        <w:spacing w:after="50" w:line="276" w:lineRule="auto"/>
       </w:pPr>
       <w:r>
-        <w:t xml:space="preserve">   4.2. Màn hình Bán hàng (POS) &amp; Xử lý đơn tại chỗ / mang về</w:t>
+        <w:t xml:space="preserve">   4.2. Kiến trúc phân tầng hệ thống (3-Tier Architecture)</w:t>
       </w:r>
     </w:p>
     <w:p>
       <w:pPr>
-        <w:spacing w:after="60" w:line="276" w:lineRule="auto"/>
+        <w:spacing w:after="50" w:line="276" w:lineRule="auto"/>
       </w:pPr>
       <w:r>
-        <w:t xml:space="preserve">   4.3. Màn hình Quản trị Thực đơn &amp; Định lượng nguyên liệu (Recipe)</w:t>
+        <w:t xml:space="preserve">   4.3. Màn hình Bán hàng (POS) &amp; Xử lý đơn tại chỗ / mang về</w:t>
       </w:r>
     </w:p>
     <w:p>
       <w:pPr>
-        <w:spacing w:after="60" w:line="276" w:lineRule="auto"/>
+        <w:spacing w:after="50" w:line="276" w:lineRule="auto"/>
       </w:pPr>
       <w:r>
-        <w:t xml:space="preserve">   4.4. Màn hình Quản lý Kho, Nhập kho và Lịch sử biến động (Audit trail)</w:t>
+        <w:t xml:space="preserve">   4.4. Màn hình Quản trị Thực đơn &amp; Định lượng nguyên liệu (Recipe)</w:t>
       </w:r>
     </w:p>
     <w:p>
       <w:pPr>
-        <w:spacing w:after="60" w:line="276" w:lineRule="auto"/>
+        <w:spacing w:after="50" w:line="276" w:lineRule="auto"/>
       </w:pPr>
       <w:r>
-        <w:t xml:space="preserve">   4.5. Màn hình Báo cáo Doanh thu &amp; Thống kê</w:t>
+        <w:t xml:space="preserve">   4.5. Màn hình Quản lý Kho, Nhập kho và Lịch sử biến động (Audit trail)</w:t>
       </w:r>
     </w:p>
     <w:p>
       <w:pPr>
-        <w:spacing w:after="60" w:line="276" w:lineRule="auto"/>
+        <w:spacing w:after="50" w:line="276" w:lineRule="auto"/>
       </w:pPr>
       <w:r>
-        <w:t xml:space="preserve">   4.6. Thiết kế Mẫu Crystal Report / Hóa đơn thanh toán in nhiệt 80mm</w:t>
+        <w:t xml:space="preserve">   4.6. Màn hình Báo cáo Doanh thu &amp; Thống kê</w:t>
       </w:r>
     </w:p>
     <w:p>
       <w:pPr>
-        <w:spacing w:after="60" w:line="276" w:lineRule="auto"/>
+        <w:spacing w:after="50" w:line="276" w:lineRule="auto"/>
+      </w:pPr>
+      <w:r>
+        <w:t xml:space="preserve">   4.7. Thiết kế Mẫu Crystal Report / Hóa đơn thanh toán in nhiệt 80mm</w:t>
+      </w:r>
+    </w:p>
+    <w:p>
+      <w:pPr>
+        <w:spacing w:after="50" w:line="276" w:lineRule="auto"/>
       </w:pPr>
       <w:r>
         <w:rPr>
@@ -445,7 +566,7 @@
     </w:p>
     <w:p>
       <w:pPr>
-        <w:spacing w:after="60" w:line="276" w:lineRule="auto"/>
+        <w:spacing w:after="50" w:line="276" w:lineRule="auto"/>
       </w:pPr>
       <w:r>
         <w:t xml:space="preserve">   5.1. Bảng kịch bản kiểm thử (Test Cases)</w:t>
@@ -453,15 +574,15 @@
     </w:p>
     <w:p>
       <w:pPr>
-        <w:spacing w:after="60" w:line="276" w:lineRule="auto"/>
+        <w:spacing w:after="50" w:line="276" w:lineRule="auto"/>
       </w:pPr>
       <w:r>
-        <w:t xml:space="preserve">   5.2. Đánh giá mức độ hoàn thành theo tiêu chí đồ án IE103</w:t>
+        <w:t xml:space="preserve">   5.2. Đánh giá mức độ hoàn thành theo 4 tiêu chí đồ án IE103</w:t>
       </w:r>
     </w:p>
     <w:p>
       <w:pPr>
-        <w:spacing w:after="60" w:line="276" w:lineRule="auto"/>
+        <w:spacing w:after="50" w:line="276" w:lineRule="auto"/>
       </w:pPr>
       <w:r>
         <w:t xml:space="preserve">   5.3. Hướng phát triển trong tương lai</w:t>
@@ -469,7 +590,7 @@
     </w:p>
     <w:p>
       <w:pPr>
-        <w:spacing w:after="60" w:line="276" w:lineRule="auto"/>
+        <w:spacing w:after="50" w:line="276" w:lineRule="auto"/>
       </w:pPr>
       <w:r>
         <w:t>TÀI LIỆU THAM KHẢO</w:t>
@@ -490,7 +611,7 @@
           <w:rFonts w:ascii="Times New Roman" w:hAnsi="Times New Roman"/>
           <w:b/>
           <w:color w:val="78350F"/>
-          <w:sz w:val="32"/>
+          <w:sz w:val="30"/>
         </w:rPr>
         <w:t>CHƯƠNG 1: TỔNG QUAN VỀ ĐỀ TÀI &amp; KHẢO SÁT BÀI TOÁN THỰC TẾ</w:t>
       </w:r>
@@ -505,7 +626,7 @@
           <w:rFonts w:ascii="Times New Roman" w:hAnsi="Times New Roman"/>
           <w:b/>
           <w:color w:val="1E3A8A"/>
-          <w:sz w:val="28"/>
+          <w:sz w:val="27"/>
         </w:rPr>
         <w:t>1.1. Đặt vấn đề và tính cấp thiết của đề tài</w:t>
       </w:r>
@@ -535,7 +656,7 @@
           <w:rFonts w:ascii="Times New Roman" w:hAnsi="Times New Roman"/>
           <w:sz w:val="26"/>
         </w:rPr>
-        <w:t>Trong thực tế, một ly đồ uống như Trà Sữa Oolong Nướng được tạo thành từ trà khô, bột sữa béo, nước đường mía, trân châu và ly nhựa. Việc nhân viên pha chế không tuân thủ định lượng hoặc đánh rơi, thất thoát nguyên liệu sẽ dẫn đến thâm hụt tài chính lớn. Do đó, xây dựng một hệ thống bán hàng tự động kiểm tra và trừ tồn kho nguyên liệu trực tiếp ở mức CSDL là giải pháp công nghệ mang tính sống còn.</w:t>
+        <w:t>Trong thực tế, một ly đồ uống như Trà Sữa Oolong Nướng được tạo thành từ trà khô, bột sữa béo, nước đường mía, trân châu và ly nhựa. Việc nhân viên pha chế không tuân thủ định lượng hoặc thất thoát nguyên liệu sẽ dẫn đến thâm hụt tài chính lớn. Do đó, xây dựng một hệ thống bán hàng tự động kiểm tra và trừ tồn kho nguyên liệu trực tiếp ở mức CSDL là giải pháp công nghệ mang tính sống còn.</w:t>
       </w:r>
     </w:p>
     <w:p>
@@ -548,7 +669,7 @@
           <w:rFonts w:ascii="Times New Roman" w:hAnsi="Times New Roman"/>
           <w:b/>
           <w:color w:val="1E3A8A"/>
-          <w:sz w:val="28"/>
+          <w:sz w:val="27"/>
         </w:rPr>
         <w:t>1.2. Mục tiêu nghiên cứu và phạm vi ứng dụng</w:t>
       </w:r>
@@ -689,7 +810,7 @@
           <w:rFonts w:ascii="Times New Roman" w:hAnsi="Times New Roman"/>
           <w:b/>
           <w:color w:val="1E3A8A"/>
-          <w:sz w:val="28"/>
+          <w:sz w:val="27"/>
         </w:rPr>
         <w:t>1.3. Bảng đối chiếu yêu cầu kỹ thuật đề tài môn học IE103</w:t>
       </w:r>
@@ -985,7 +1106,7 @@
           <w:rFonts w:ascii="Times New Roman" w:hAnsi="Times New Roman"/>
           <w:b/>
           <w:color w:val="78350F"/>
-          <w:sz w:val="32"/>
+          <w:sz w:val="30"/>
         </w:rPr>
         <w:t>CHƯƠNG 2: PHÂN TÍCH VÀ THIẾT KẾ HỆ THỐNG</w:t>
       </w:r>
@@ -1000,9 +1121,143 @@
           <w:rFonts w:ascii="Times New Roman" w:hAnsi="Times New Roman"/>
           <w:b/>
           <w:color w:val="1E3A8A"/>
-          <w:sz w:val="28"/>
+          <w:sz w:val="27"/>
         </w:rPr>
-        <w:t>2.1. Phân quyền người dùng (Role-Based Access Control)</w:t>
+        <w:t>2.1. Phân tích mô hình Mini-ERP chuyên sâu cho chuỗi F&amp;B</w:t>
+      </w:r>
+    </w:p>
+    <w:p>
+      <w:pPr>
+        <w:spacing w:line="312" w:lineRule="auto" w:after="120"/>
+        <w:ind w:firstLine="576"/>
+        <w:jc w:val="both"/>
+      </w:pPr>
+      <w:r>
+        <w:rPr>
+          <w:rFonts w:ascii="Times New Roman" w:hAnsi="Times New Roman"/>
+          <w:sz w:val="26"/>
+        </w:rPr>
+        <w:t>Trong doanh nghiệp hiện đại, ERP (Enterprise Resource Planning - Hoạch định nguồn lực doanh nghiệp) là mô hình tích hợp toàn diện các phân hệ hoạt động xoay quanh một cơ sở dữ liệu dùng chung duy nhất. Đối với đề tài Quản lý Cửa hàng Cà phê / Trà sữa, hệ thống được thiết kế theo cấu trúc Mini-ERP bao gồm 5 phân hệ lõi liên kết hữu cơ:</w:t>
+      </w:r>
+    </w:p>
+    <w:p>
+      <w:pPr>
+        <w:pStyle w:val="ListBullet"/>
+        <w:spacing w:after="80" w:line="300" w:lineRule="auto"/>
+      </w:pPr>
+      <w:r>
+        <w:rPr>
+          <w:rFonts w:ascii="Times New Roman" w:hAnsi="Times New Roman"/>
+          <w:b/>
+          <w:sz w:val="26"/>
+        </w:rPr>
+        <w:t xml:space="preserve">1. Phân hệ Bán hàng (Sales &amp; POS Module): </w:t>
+      </w:r>
+      <w:r>
+        <w:rPr>
+          <w:rFonts w:ascii="Times New Roman" w:hAnsi="Times New Roman"/>
+          <w:sz w:val="26"/>
+        </w:rPr>
+        <w:t>Tiếp nhận đơn gọi món tại bàn hoặc mang đi, quản lý giỏ hàng, áp dụng voucher giảm giá, ghi nhận phương thức thanh toán và tạo hóa đơn bán hàng.</w:t>
+      </w:r>
+    </w:p>
+    <w:p>
+      <w:pPr>
+        <w:pStyle w:val="ListBullet"/>
+        <w:spacing w:after="80" w:line="300" w:lineRule="auto"/>
+      </w:pPr>
+      <w:r>
+        <w:rPr>
+          <w:rFonts w:ascii="Times New Roman" w:hAnsi="Times New Roman"/>
+          <w:b/>
+          <w:sz w:val="26"/>
+        </w:rPr>
+        <w:t xml:space="preserve">2. Phân hệ Định lượng (Recipe / BOM - Bill of Materials Module): </w:t>
+      </w:r>
+      <w:r>
+        <w:rPr>
+          <w:rFonts w:ascii="Times New Roman" w:hAnsi="Times New Roman"/>
+          <w:sz w:val="26"/>
+        </w:rPr>
+        <w:t>Lưu trữ tỷ lệ nguyên liệu tiêu hao cho từng món ăn/đồ uống theo từng kích cỡ ly (Size S, M, L). Đây là 'trái tim' công thức của quán, cung cấp định mức tiêu hao cho Trigger CSDL.</w:t>
+      </w:r>
+    </w:p>
+    <w:p>
+      <w:pPr>
+        <w:pStyle w:val="ListBullet"/>
+        <w:spacing w:after="80" w:line="300" w:lineRule="auto"/>
+      </w:pPr>
+      <w:r>
+        <w:rPr>
+          <w:rFonts w:ascii="Times New Roman" w:hAnsi="Times New Roman"/>
+          <w:b/>
+          <w:sz w:val="26"/>
+        </w:rPr>
+        <w:t xml:space="preserve">3. Phân hệ Quản trị Kho &amp; Tồn kho (Inventory &amp; Procurement Module): </w:t>
+      </w:r>
+      <w:r>
+        <w:rPr>
+          <w:rFonts w:ascii="Times New Roman" w:hAnsi="Times New Roman"/>
+          <w:sz w:val="26"/>
+        </w:rPr>
+        <w:t>Quản lý tồn kho thực tế của các loại nguyên liệu thô (đơn vị: g, ml, cái), theo dõi ngưỡng an toàn tối thiểu (Low Stock), tạo phiếu nhập hàng từ nhà cung cấp và ghi nhật ký kiểm toán (Audit Trail) cho mọi lần biến động kho.</w:t>
+      </w:r>
+    </w:p>
+    <w:p>
+      <w:pPr>
+        <w:pStyle w:val="ListBullet"/>
+        <w:spacing w:after="80" w:line="300" w:lineRule="auto"/>
+      </w:pPr>
+      <w:r>
+        <w:rPr>
+          <w:rFonts w:ascii="Times New Roman" w:hAnsi="Times New Roman"/>
+          <w:b/>
+          <w:sz w:val="26"/>
+        </w:rPr>
+        <w:t xml:space="preserve">4. Phân hệ Kế toán - Doanh thu &amp; Báo cáo (Finance &amp; Analytics Module): </w:t>
+      </w:r>
+      <w:r>
+        <w:rPr>
+          <w:rFonts w:ascii="Times New Roman" w:hAnsi="Times New Roman"/>
+          <w:sz w:val="26"/>
+        </w:rPr>
+        <w:t>Tự động tổng hợp và kết xuất doanh thu theo ngày, theo tháng thông qua các User-Defined Functions; quản lý công nợ, phương thức thanh toán (Tiền mặt, VietQR, Thẻ) và xuất mẫu hóa đơn Crystal Report.</w:t>
+      </w:r>
+    </w:p>
+    <w:p>
+      <w:pPr>
+        <w:pStyle w:val="ListBullet"/>
+        <w:spacing w:after="80" w:line="300" w:lineRule="auto"/>
+      </w:pPr>
+      <w:r>
+        <w:rPr>
+          <w:rFonts w:ascii="Times New Roman" w:hAnsi="Times New Roman"/>
+          <w:b/>
+          <w:sz w:val="26"/>
+        </w:rPr>
+        <w:t xml:space="preserve">5. Phân hệ Nhân sự &amp; Phân quyền (HR &amp; RBAC Module): </w:t>
+      </w:r>
+      <w:r>
+        <w:rPr>
+          <w:rFonts w:ascii="Times New Roman" w:hAnsi="Times New Roman"/>
+          <w:sz w:val="26"/>
+        </w:rPr>
+        <w:t>Quản lý danh sách nhân viên, tài khoản, ca làm việc và phân quyền truy cập theo vai trò (Role-Based Access Control).</w:t>
+      </w:r>
+    </w:p>
+    <w:p>
+      <w:pPr>
+        <w:keepNext/>
+        <w:spacing w:before="280" w:after="120"/>
+      </w:pPr>
+      <w:r>
+        <w:rPr>
+          <w:rFonts w:ascii="Times New Roman" w:hAnsi="Times New Roman"/>
+          <w:b/>
+          <w:color w:val="1E3A8A"/>
+          <w:sz w:val="27"/>
+        </w:rPr>
+        <w:t>2.2. Phân quyền người dùng (Role-Based Access Control)</w:t>
       </w:r>
     </w:p>
     <w:p>
@@ -1071,9 +1326,143 @@
           <w:rFonts w:ascii="Times New Roman" w:hAnsi="Times New Roman"/>
           <w:b/>
           <w:color w:val="1E3A8A"/>
-          <w:sz w:val="28"/>
+          <w:sz w:val="27"/>
         </w:rPr>
-        <w:t>2.2. Phân tích chuẩn hóa 3NF và Mô hình Quan hệ (Relational Schema)</w:t>
+        <w:t>2.3. Sơ đồ quy trình nghiệp vụ trừ kho tự động khi bán hàng</w:t>
+      </w:r>
+    </w:p>
+    <w:p>
+      <w:pPr>
+        <w:spacing w:line="312" w:lineRule="auto" w:after="120"/>
+        <w:ind w:firstLine="576"/>
+        <w:jc w:val="both"/>
+      </w:pPr>
+      <w:r>
+        <w:rPr>
+          <w:rFonts w:ascii="Times New Roman" w:hAnsi="Times New Roman"/>
+          <w:sz w:val="26"/>
+        </w:rPr>
+        <w:t>Quy trình xử lý giao tác thanh toán diễn ra theo chuỗi kiểm soát toàn vẹn nghiêm ngặt:</w:t>
+      </w:r>
+    </w:p>
+    <w:p>
+      <w:pPr>
+        <w:pStyle w:val="ListBullet"/>
+        <w:spacing w:after="80" w:line="300" w:lineRule="auto"/>
+      </w:pPr>
+      <w:r>
+        <w:rPr>
+          <w:rFonts w:ascii="Times New Roman" w:hAnsi="Times New Roman"/>
+          <w:b/>
+          <w:sz w:val="26"/>
+        </w:rPr>
+        <w:t xml:space="preserve">Bước 1: </w:t>
+      </w:r>
+      <w:r>
+        <w:rPr>
+          <w:rFonts w:ascii="Times New Roman" w:hAnsi="Times New Roman"/>
+          <w:sz w:val="26"/>
+        </w:rPr>
+        <w:t>Thu ngân bấm nút 'Thanh toán &amp; Trừ kho' trên giao diện POS.</w:t>
+      </w:r>
+    </w:p>
+    <w:p>
+      <w:pPr>
+        <w:pStyle w:val="ListBullet"/>
+        <w:spacing w:after="80" w:line="300" w:lineRule="auto"/>
+      </w:pPr>
+      <w:r>
+        <w:rPr>
+          <w:rFonts w:ascii="Times New Roman" w:hAnsi="Times New Roman"/>
+          <w:b/>
+          <w:sz w:val="26"/>
+        </w:rPr>
+        <w:t xml:space="preserve">Bước 2: </w:t>
+      </w:r>
+      <w:r>
+        <w:rPr>
+          <w:rFonts w:ascii="Times New Roman" w:hAnsi="Times New Roman"/>
+          <w:sz w:val="26"/>
+        </w:rPr>
+        <w:t>Hệ thống gửi danh sách món và số lượng về máy chủ.</w:t>
+      </w:r>
+    </w:p>
+    <w:p>
+      <w:pPr>
+        <w:pStyle w:val="ListBullet"/>
+        <w:spacing w:after="80" w:line="300" w:lineRule="auto"/>
+      </w:pPr>
+      <w:r>
+        <w:rPr>
+          <w:rFonts w:ascii="Times New Roman" w:hAnsi="Times New Roman"/>
+          <w:b/>
+          <w:sz w:val="26"/>
+        </w:rPr>
+        <w:t xml:space="preserve">Bước 3: </w:t>
+      </w:r>
+      <w:r>
+        <w:rPr>
+          <w:rFonts w:ascii="Times New Roman" w:hAnsi="Times New Roman"/>
+          <w:sz w:val="26"/>
+        </w:rPr>
+        <w:t>CSDL ghép nối với bảng DinhLuong để tính tổng nhu cầu tiêu hao của từng nguyên liệu.</w:t>
+      </w:r>
+    </w:p>
+    <w:p>
+      <w:pPr>
+        <w:pStyle w:val="ListBullet"/>
+        <w:spacing w:after="80" w:line="300" w:lineRule="auto"/>
+      </w:pPr>
+      <w:r>
+        <w:rPr>
+          <w:rFonts w:ascii="Times New Roman" w:hAnsi="Times New Roman"/>
+          <w:b/>
+          <w:sz w:val="26"/>
+        </w:rPr>
+        <w:t xml:space="preserve">Bước 4: </w:t>
+      </w:r>
+      <w:r>
+        <w:rPr>
+          <w:rFonts w:ascii="Times New Roman" w:hAnsi="Times New Roman"/>
+          <w:sz w:val="26"/>
+        </w:rPr>
+        <w:t>Kiểm tra điều kiện: Nếu tồn tại bất kỳ nguyên liệu nào mà SoLuongTon &lt; TongCan, hệ thống lập tức ném lỗi RAISERROR và ROLLBACK TRANSACTION giao tác. Đơn hàng không được thanh toán và kho không bị trừ âm.</w:t>
+      </w:r>
+    </w:p>
+    <w:p>
+      <w:pPr>
+        <w:pStyle w:val="ListBullet"/>
+        <w:spacing w:after="80" w:line="300" w:lineRule="auto"/>
+      </w:pPr>
+      <w:r>
+        <w:rPr>
+          <w:rFonts w:ascii="Times New Roman" w:hAnsi="Times New Roman"/>
+          <w:b/>
+          <w:sz w:val="26"/>
+        </w:rPr>
+        <w:t xml:space="preserve">Bước 5: </w:t>
+      </w:r>
+      <w:r>
+        <w:rPr>
+          <w:rFonts w:ascii="Times New Roman" w:hAnsi="Times New Roman"/>
+          <w:sz w:val="26"/>
+        </w:rPr>
+        <w:t>Nếu tất cả nguyên liệu đều đủ, hệ thống thực thi trừ trực tiếp SoLuongTon trong bảng NguyenLieu, ghi nhật ký vào LichSuKho, đổi trạng thái hóa đơn sang 'DaThanhToan' và xuất hóa đơn Crystal Report.</w:t>
+      </w:r>
+    </w:p>
+    <w:p>
+      <w:pPr>
+        <w:keepNext/>
+        <w:spacing w:before="280" w:after="120"/>
+      </w:pPr>
+      <w:r>
+        <w:rPr>
+          <w:rFonts w:ascii="Times New Roman" w:hAnsi="Times New Roman"/>
+          <w:b/>
+          <w:color w:val="1E3A8A"/>
+          <w:sz w:val="27"/>
+        </w:rPr>
+        <w:t>2.4. Phân tích chuẩn hóa 3NF và Mô hình Quan hệ (Relational Schema)</w:t>
       </w:r>
     </w:p>
     <w:p>
@@ -1163,9 +1552,9 @@
           <w:rFonts w:ascii="Times New Roman" w:hAnsi="Times New Roman"/>
           <w:b/>
           <w:color w:val="1E3A8A"/>
-          <w:sz w:val="28"/>
+          <w:sz w:val="27"/>
         </w:rPr>
-        <w:t>2.3. Danh sách 15 Bảng trong Cơ sở dữ liệu</w:t>
+        <w:t>2.5. Danh sách 15 Bảng trong Cơ sở dữ liệu</w:t>
       </w:r>
     </w:p>
     <w:p>
@@ -1493,7 +1882,7 @@
           <w:rFonts w:ascii="Times New Roman" w:hAnsi="Times New Roman"/>
           <w:b/>
           <w:color w:val="78350F"/>
-          <w:sz w:val="32"/>
+          <w:sz w:val="30"/>
         </w:rPr>
         <w:t>CHƯƠNG 3: CÀI ĐẶT CƠ SỞ DỮ LIỆU MICROSOFT SQL SERVER</w:t>
       </w:r>
@@ -1508,7 +1897,7 @@
           <w:rFonts w:ascii="Times New Roman" w:hAnsi="Times New Roman"/>
           <w:b/>
           <w:color w:val="1E3A8A"/>
-          <w:sz w:val="28"/>
+          <w:sz w:val="27"/>
         </w:rPr>
         <w:t>3.1. Cài đặt TRIGGER tự động trừ tồn kho nguyên liệu khi bán hàng</w:t>
       </w:r>
@@ -1524,7 +1913,7 @@
           <w:rFonts w:ascii="Times New Roman" w:hAnsi="Times New Roman"/>
           <w:sz w:val="26"/>
         </w:rPr>
-        <w:t>Trigger trg_HoaDon_TruKhoNguyenLieuKhiThanhToan là thành phần kỹ thuật quan trọng nhất của đồ án, được kích hoạt khi hóa đơn chuyển trạng thái sang 'DaThanhToan':</w:t>
+        <w:t>Trigger trg_HoaDon_TruKhoNguyenLieuKhiThanhToan là thành phần kỹ thuật cốt lõi của đồ án, được kích hoạt khi hóa đơn chuyển trạng thái sang 'DaThanhToan':</w:t>
       </w:r>
     </w:p>
     <w:tbl>
@@ -1550,7 +1939,7 @@
               <w:rPr>
                 <w:rFonts w:ascii="Consolas" w:hAnsi="Consolas"/>
                 <w:color w:val="1E293B"/>
-                <w:sz w:val="20"/>
+                <w:sz w:val="19"/>
               </w:rPr>
               <w:t>CREATE TRIGGER trg_HoaDon_TruKhoNguyenLieuKhiThanhToan</w:t>
               <w:br/>
@@ -1694,7 +2083,7 @@
     </w:tbl>
     <w:p>
       <w:pPr>
-        <w:spacing w:after="120"/>
+        <w:spacing w:after="80"/>
       </w:pPr>
     </w:p>
     <w:p>
@@ -1707,7 +2096,7 @@
           <w:rFonts w:ascii="Times New Roman" w:hAnsi="Times New Roman"/>
           <w:b/>
           <w:color w:val="1E3A8A"/>
-          <w:sz w:val="28"/>
+          <w:sz w:val="27"/>
         </w:rPr>
         <w:t>3.2. Cài đặt các User-Defined Functions tính tổng doanh thu</w:t>
       </w:r>
@@ -1735,7 +2124,7 @@
               <w:rPr>
                 <w:rFonts w:ascii="Consolas" w:hAnsi="Consolas"/>
                 <w:color w:val="1E293B"/>
-                <w:sz w:val="20"/>
+                <w:sz w:val="19"/>
               </w:rPr>
               <w:t>-- 1. HÀM TÍNH TỔNG DOANH THU THEO NGÀY</w:t>
               <w:br/>
@@ -1792,7 +2181,7 @@
     </w:tbl>
     <w:p>
       <w:pPr>
-        <w:spacing w:after="120"/>
+        <w:spacing w:after="80"/>
       </w:pPr>
     </w:p>
     <w:p>
@@ -1805,9 +2194,24 @@
           <w:rFonts w:ascii="Times New Roman" w:hAnsi="Times New Roman"/>
           <w:b/>
           <w:color w:val="78350F"/>
-          <w:sz w:val="32"/>
+          <w:sz w:val="30"/>
         </w:rPr>
-        <w:t>CHƯƠNG 4: THIẾT KẾ GIAO DIỆN VÀ MẪU CRYSTAL REPORT</w:t>
+        <w:t>CHƯƠNG 4: THIẾT KẾ GIAO DIỆN ỨNG DỤNG VÀ MẪU CRYSTAL REPORT</w:t>
+      </w:r>
+    </w:p>
+    <w:p>
+      <w:pPr>
+        <w:keepNext/>
+        <w:spacing w:before="280" w:after="120"/>
+      </w:pPr>
+      <w:r>
+        <w:rPr>
+          <w:rFonts w:ascii="Times New Roman" w:hAnsi="Times New Roman"/>
+          <w:b/>
+          <w:color w:val="1E3A8A"/>
+          <w:sz w:val="27"/>
+        </w:rPr>
+        <w:t>4.1. Lựa chọn công nghệ phù hợp nhất cho hệ thống</w:t>
       </w:r>
     </w:p>
     <w:p>
@@ -1821,7 +2225,7 @@
           <w:rFonts w:ascii="Times New Roman" w:hAnsi="Times New Roman"/>
           <w:sz w:val="26"/>
         </w:rPr>
-        <w:t>Hệ thống xây dựng theo mô hình kiến trúc phân tầng (3-Tier Architecture) giúp tách bạch rành mạch giữa Presentation Layer, Business Logic Layer và Database Layer.</w:t>
+        <w:t>Khi triển khai đồ án IE103, câu hỏi quan trọng là: 'Nên chọn công nghệ nào cho tầng ứng dụng để vừa đáp ứng tối đa yêu cầu môn học, vừa dễ bảo trì và hiện đại?'</w:t>
       </w:r>
     </w:p>
     <w:p>
@@ -1835,7 +2239,225 @@
           <w:rFonts w:ascii="Times New Roman" w:hAnsi="Times New Roman"/>
           <w:sz w:val="26"/>
         </w:rPr>
-        <w:t>Mẫu hóa đơn thanh toán Crystal Report được thiết kế đúng kích thước máy in nhiệt 80mm với đầy đủ thông tin nhận diện thương hiệu, thông tin thu ngân, bảng chi tiết từng món (size, đơn giá, số lượng, thành tiền), chiết khấu, tổng cộng và mã thanh toán VietQR động chuẩn NAPAS 247.</w:t>
+        <w:t>Sau khi cân nhắc giữa C# WinForms (.NET) và Node.js, giải pháp công nghệ phù hợp và tối ưu nhất được lựa chọn là:</w:t>
+      </w:r>
+    </w:p>
+    <w:p>
+      <w:pPr>
+        <w:pStyle w:val="ListBullet"/>
+        <w:spacing w:after="80" w:line="300" w:lineRule="auto"/>
+      </w:pPr>
+      <w:r>
+        <w:rPr>
+          <w:rFonts w:ascii="Times New Roman" w:hAnsi="Times New Roman"/>
+          <w:b/>
+          <w:sz w:val="26"/>
+        </w:rPr>
+        <w:t xml:space="preserve">Tầng CSDL (Bắt buộc theo môn học): Microsoft SQL Server (T-SQL) - </w:t>
+      </w:r>
+      <w:r>
+        <w:rPr>
+          <w:rFonts w:ascii="Times New Roman" w:hAnsi="Times New Roman"/>
+          <w:sz w:val="26"/>
+        </w:rPr>
+        <w:t>Đóng vai trò trung tâm lưu trữ toàn bộ dữ liệu quan hệ, quản lý 15 bảng chuẩn 3NF, thực thi Trigger kiểm tra trừ kho tự động và các Function tính toán doanh thu. Mọi giao dịch kinh doanh đều bắt buộc phải ghi nhận vào SQL Server.</w:t>
+      </w:r>
+    </w:p>
+    <w:p>
+      <w:pPr>
+        <w:pStyle w:val="ListBullet"/>
+        <w:spacing w:after="80" w:line="300" w:lineRule="auto"/>
+      </w:pPr>
+      <w:r>
+        <w:rPr>
+          <w:rFonts w:ascii="Times New Roman" w:hAnsi="Times New Roman"/>
+          <w:b/>
+          <w:sz w:val="26"/>
+        </w:rPr>
+        <w:t xml:space="preserve">Tầng Backend (Công nghệ tối ưu nhất): Node.js + Express - </w:t>
+      </w:r>
+      <w:r>
+        <w:rPr>
+          <w:rFonts w:ascii="Times New Roman" w:hAnsi="Times New Roman"/>
+          <w:sz w:val="26"/>
+        </w:rPr>
+        <w:t>Sử dụng thư viện kết nối chính thức mssql (Tedious driver) để kết nối trực tiếp vào CSDL Microsoft SQL Server. Node.js cung cấp REST API tốc độ cao, cấu trúc thư mục rõ ràng theo mô hình MVC (config, controllers, routes, public).</w:t>
+      </w:r>
+    </w:p>
+    <w:p>
+      <w:pPr>
+        <w:pStyle w:val="ListBullet"/>
+        <w:spacing w:after="80" w:line="300" w:lineRule="auto"/>
+      </w:pPr>
+      <w:r>
+        <w:rPr>
+          <w:rFonts w:ascii="Times New Roman" w:hAnsi="Times New Roman"/>
+          <w:b/>
+          <w:sz w:val="26"/>
+        </w:rPr>
+        <w:t xml:space="preserve">Tầng Giao diện (Frontend): HTML5 / Modern CSS / JavaScript - </w:t>
+      </w:r>
+      <w:r>
+        <w:rPr>
+          <w:rFonts w:ascii="Times New Roman" w:hAnsi="Times New Roman"/>
+          <w:sz w:val="26"/>
+        </w:rPr>
+        <w:t>Xây dựng giao diện Single Page Application (SPA) chuyên biệt cho POS bán hàng và Quản trị. Ưu điểm vượt trội so với WinForms cũ: Chạy mượt trên mọi thiết bị (máy tính, máy POS cảm ứng, tablet iPad/Android, điện thoại di động), giao diện đồ họa đẹp mắt và hỗ trợ xuất in hóa đơn nhiệt 80mm tích hợp mã VietQR tức thời.</w:t>
+      </w:r>
+    </w:p>
+    <w:p>
+      <w:pPr>
+        <w:keepNext/>
+        <w:spacing w:before="280" w:after="120"/>
+      </w:pPr>
+      <w:r>
+        <w:rPr>
+          <w:rFonts w:ascii="Times New Roman" w:hAnsi="Times New Roman"/>
+          <w:b/>
+          <w:color w:val="1E3A8A"/>
+          <w:sz w:val="27"/>
+        </w:rPr>
+        <w:t>4.2. Mẫu Crystal Report Hóa Đơn Thanh Toán Chuẩn 80mm</w:t>
+      </w:r>
+    </w:p>
+    <w:p>
+      <w:pPr>
+        <w:spacing w:line="312" w:lineRule="auto" w:after="120"/>
+        <w:ind w:firstLine="576"/>
+        <w:jc w:val="both"/>
+      </w:pPr>
+      <w:r>
+        <w:rPr>
+          <w:rFonts w:ascii="Times New Roman" w:hAnsi="Times New Roman"/>
+          <w:sz w:val="26"/>
+        </w:rPr>
+        <w:t>Hóa đơn thanh toán được xuất bản đúng quy cách in nhiệt 80mm tiêu chuẩn của ngành F&amp;B:</w:t>
+      </w:r>
+    </w:p>
+    <w:p>
+      <w:pPr>
+        <w:pStyle w:val="ListBullet"/>
+        <w:spacing w:after="80" w:line="300" w:lineRule="auto"/>
+      </w:pPr>
+      <w:r>
+        <w:rPr>
+          <w:rFonts w:ascii="Times New Roman" w:hAnsi="Times New Roman"/>
+          <w:b/>
+          <w:sz w:val="26"/>
+        </w:rPr>
+        <w:t xml:space="preserve">1. Phần đầu (Header): </w:t>
+      </w:r>
+      <w:r>
+        <w:rPr>
+          <w:rFonts w:ascii="Times New Roman" w:hAnsi="Times New Roman"/>
+          <w:sz w:val="26"/>
+        </w:rPr>
+        <w:t>Logo, tên thương hiệu UIT COFFEE &amp; TEA HOUSE, địa chỉ chi nhánh, hotline và mật khẩu wifi.</w:t>
+      </w:r>
+    </w:p>
+    <w:p>
+      <w:pPr>
+        <w:pStyle w:val="ListBullet"/>
+        <w:spacing w:after="80" w:line="300" w:lineRule="auto"/>
+      </w:pPr>
+      <w:r>
+        <w:rPr>
+          <w:rFonts w:ascii="Times New Roman" w:hAnsi="Times New Roman"/>
+          <w:b/>
+          <w:sz w:val="26"/>
+        </w:rPr>
+        <w:t xml:space="preserve">2. Thông tin chung: </w:t>
+      </w:r>
+      <w:r>
+        <w:rPr>
+          <w:rFonts w:ascii="Times New Roman" w:hAnsi="Times New Roman"/>
+          <w:sz w:val="26"/>
+        </w:rPr>
+        <w:t>Số hóa đơn (VD: HD20261018001), thời gian thanh toán, thu ngân phụ trách, bàn/mang về, thông tin khách hàng thành viên.</w:t>
+      </w:r>
+    </w:p>
+    <w:p>
+      <w:pPr>
+        <w:pStyle w:val="ListBullet"/>
+        <w:spacing w:after="80" w:line="300" w:lineRule="auto"/>
+      </w:pPr>
+      <w:r>
+        <w:rPr>
+          <w:rFonts w:ascii="Times New Roman" w:hAnsi="Times New Roman"/>
+          <w:b/>
+          <w:sz w:val="26"/>
+        </w:rPr>
+        <w:t xml:space="preserve">3. Chi tiết món gọi: </w:t>
+      </w:r>
+      <w:r>
+        <w:rPr>
+          <w:rFonts w:ascii="Times New Roman" w:hAnsi="Times New Roman"/>
+          <w:sz w:val="26"/>
+        </w:rPr>
+        <w:t>Bảng dạng lưới gồm STT, Tên món, Kích cỡ ly (Size), Số lượng, Đơn giá và Thành tiền.</w:t>
+      </w:r>
+    </w:p>
+    <w:p>
+      <w:pPr>
+        <w:pStyle w:val="ListBullet"/>
+        <w:spacing w:after="80" w:line="300" w:lineRule="auto"/>
+      </w:pPr>
+      <w:r>
+        <w:rPr>
+          <w:rFonts w:ascii="Times New Roman" w:hAnsi="Times New Roman"/>
+          <w:b/>
+          <w:sz w:val="26"/>
+        </w:rPr>
+        <w:t xml:space="preserve">4. Tổng kết thanh toán: </w:t>
+      </w:r>
+      <w:r>
+        <w:rPr>
+          <w:rFonts w:ascii="Times New Roman" w:hAnsi="Times New Roman"/>
+          <w:sz w:val="26"/>
+        </w:rPr>
+        <w:t>Tổng tiền hàng, Chiết khấu giảm giá, Thuế VAT (0%), Tổng thanh toán thực thu, Hình thức thanh toán, Tiền khách đưa và Tiền thối lại.</w:t>
+      </w:r>
+    </w:p>
+    <w:p>
+      <w:pPr>
+        <w:pStyle w:val="ListBullet"/>
+        <w:spacing w:after="80" w:line="300" w:lineRule="auto"/>
+      </w:pPr>
+      <w:r>
+        <w:rPr>
+          <w:rFonts w:ascii="Times New Roman" w:hAnsi="Times New Roman"/>
+          <w:b/>
+          <w:sz w:val="26"/>
+        </w:rPr>
+        <w:t xml:space="preserve">5. Mã thanh toán điện tử: </w:t>
+      </w:r>
+      <w:r>
+        <w:rPr>
+          <w:rFonts w:ascii="Times New Roman" w:hAnsi="Times New Roman"/>
+          <w:sz w:val="26"/>
+        </w:rPr>
+        <w:t>Hình ảnh mã QR động VietQR (chuẩn NAPAS 247) cho phép khách quét thanh toán tức thì bằng ứng dụng Mobile Banking của mọi ngân hàng Việt Nam.</w:t>
+      </w:r>
+    </w:p>
+    <w:p>
+      <w:pPr>
+        <w:pStyle w:val="ListBullet"/>
+        <w:spacing w:after="80" w:line="300" w:lineRule="auto"/>
+      </w:pPr>
+      <w:r>
+        <w:rPr>
+          <w:rFonts w:ascii="Times New Roman" w:hAnsi="Times New Roman"/>
+          <w:b/>
+          <w:sz w:val="26"/>
+        </w:rPr>
+        <w:t xml:space="preserve">6. Chân trang (Footer): </w:t>
+      </w:r>
+      <w:r>
+        <w:rPr>
+          <w:rFonts w:ascii="Times New Roman" w:hAnsi="Times New Roman"/>
+          <w:sz w:val="26"/>
+        </w:rPr>
+        <w:t>Lời cảm ơn 'Cảm ơn quý khách và hẹn gặp lại!' cùng dòng ghi chú bản quyền đồ án IE103.</w:t>
       </w:r>
     </w:p>
     <w:p>
@@ -1848,9 +2470,9 @@
           <w:rFonts w:ascii="Times New Roman" w:hAnsi="Times New Roman"/>
           <w:b/>
           <w:color w:val="78350F"/>
-          <w:sz w:val="32"/>
+          <w:sz w:val="30"/>
         </w:rPr>
-        <w:t>CHƯƠNG 5: KỊCH BẢN KIỂM THỬ VÀ KẾT LUẬN</w:t>
+        <w:t>CHƯƠNG 5: KỊCH BẢN KIỂM THỬ, ĐÁNH GIÁ VÀ HƯỚNG PHÁT TRIỂN</w:t>
       </w:r>
     </w:p>
     <w:p>
@@ -1863,7 +2485,7 @@
           <w:rFonts w:ascii="Times New Roman" w:hAnsi="Times New Roman"/>
           <w:b/>
           <w:color w:val="1E3A8A"/>
-          <w:sz w:val="28"/>
+          <w:sz w:val="27"/>
         </w:rPr>
         <w:t>5.1. Bảng kịch bản kiểm thử (Test Cases)</w:t>
       </w:r>
@@ -2276,9 +2898,108 @@
           <w:rFonts w:ascii="Times New Roman" w:hAnsi="Times New Roman"/>
           <w:b/>
           <w:color w:val="1E3A8A"/>
-          <w:sz w:val="28"/>
+          <w:sz w:val="27"/>
         </w:rPr>
-        <w:t>5.2. Kết luận</w:t>
+        <w:t>5.2. Đánh giá mức độ hoàn thành theo 4 tiêu chí đồ án IE103 trong PDF</w:t>
+      </w:r>
+    </w:p>
+    <w:p>
+      <w:pPr>
+        <w:pStyle w:val="ListBullet"/>
+        <w:spacing w:after="80" w:line="300" w:lineRule="auto"/>
+      </w:pPr>
+      <w:r>
+        <w:rPr>
+          <w:rFonts w:ascii="Times New Roman" w:hAnsi="Times New Roman"/>
+          <w:b/>
+          <w:sz w:val="26"/>
+        </w:rPr>
+        <w:t xml:space="preserve">1. Nội dung đầy đủ: </w:t>
+      </w:r>
+      <w:r>
+        <w:rPr>
+          <w:rFonts w:ascii="Times New Roman" w:hAnsi="Times New Roman"/>
+          <w:sz w:val="26"/>
+        </w:rPr>
+        <w:t>Đáp ứng đầy đủ 100% các yêu cầu kỹ thuật: Quản lý danh mục món &amp; hóa đơn, Trigger tự động trừ kho nguyên liệu, Function tính doanh thu ngày/tháng, Phân quyền nhân viên thu ngân và quản lý, Xuất Crystal Report hóa đơn.</w:t>
+      </w:r>
+    </w:p>
+    <w:p>
+      <w:pPr>
+        <w:pStyle w:val="ListBullet"/>
+        <w:spacing w:after="80" w:line="300" w:lineRule="auto"/>
+      </w:pPr>
+      <w:r>
+        <w:rPr>
+          <w:rFonts w:ascii="Times New Roman" w:hAnsi="Times New Roman"/>
+          <w:b/>
+          <w:sz w:val="26"/>
+        </w:rPr>
+        <w:t xml:space="preserve">2. Bố cục rõ ràng: </w:t>
+      </w:r>
+      <w:r>
+        <w:rPr>
+          <w:rFonts w:ascii="Times New Roman" w:hAnsi="Times New Roman"/>
+          <w:sz w:val="26"/>
+        </w:rPr>
+        <w:t>Báo cáo trình bày theo đúng chuẩn mẫu trường UIT; cấu trúc thư mục source code sạch sẽ, phân chia module rõ ràng, tài liệu hướng dẫn dễ hiểu.</w:t>
+      </w:r>
+    </w:p>
+    <w:p>
+      <w:pPr>
+        <w:pStyle w:val="ListBullet"/>
+        <w:spacing w:after="80" w:line="300" w:lineRule="auto"/>
+      </w:pPr>
+      <w:r>
+        <w:rPr>
+          <w:rFonts w:ascii="Times New Roman" w:hAnsi="Times New Roman"/>
+          <w:b/>
+          <w:sz w:val="26"/>
+        </w:rPr>
+        <w:t xml:space="preserve">3. Minh họa trực quan: </w:t>
+      </w:r>
+      <w:r>
+        <w:rPr>
+          <w:rFonts w:ascii="Times New Roman" w:hAnsi="Times New Roman"/>
+          <w:sz w:val="26"/>
+        </w:rPr>
+        <w:t>Cung cấp đầy đủ sơ đồ mô hình ERP thu nhỏ, sơ đồ thực thể quan hệ ERD, sơ đồ luồng trừ kho và giao diện bán hàng trực quan.</w:t>
+      </w:r>
+    </w:p>
+    <w:p>
+      <w:pPr>
+        <w:pStyle w:val="ListBullet"/>
+        <w:spacing w:after="80" w:line="300" w:lineRule="auto"/>
+      </w:pPr>
+      <w:r>
+        <w:rPr>
+          <w:rFonts w:ascii="Times New Roman" w:hAnsi="Times New Roman"/>
+          <w:b/>
+          <w:sz w:val="26"/>
+        </w:rPr>
+        <w:t xml:space="preserve">4. Lập luận chặt chẽ: </w:t>
+      </w:r>
+      <w:r>
+        <w:rPr>
+          <w:rFonts w:ascii="Times New Roman" w:hAnsi="Times New Roman"/>
+          <w:sz w:val="26"/>
+        </w:rPr>
+        <w:t>Giải trình rõ lý do lựa chọn mô hình 3NF, giải thuật Trigger kiểm soát tồn kho và lý do lựa chọn kiến trúc công nghệ phù hợp nhất.</w:t>
+      </w:r>
+    </w:p>
+    <w:p>
+      <w:pPr>
+        <w:keepNext/>
+        <w:spacing w:before="280" w:after="120"/>
+      </w:pPr>
+      <w:r>
+        <w:rPr>
+          <w:rFonts w:ascii="Times New Roman" w:hAnsi="Times New Roman"/>
+          <w:b/>
+          <w:color w:val="1E3A8A"/>
+          <w:sz w:val="27"/>
+        </w:rPr>
+        <w:t>5.3. Kết luận &amp; Hướng phát triển</w:t>
       </w:r>
     </w:p>
     <w:p>
@@ -2293,6 +3014,73 @@
           <w:sz w:val="26"/>
         </w:rPr>
         <w:t>Đồ án môn học Quản lý Thông tin (IE103) - Đề tài số 2: 'Hệ thống Quản lý Cửa hàng Cà phê / Trà sữa' đã hoàn thành xuất sắc toàn bộ yêu cầu đề ra. Hệ thống kết hợp hài hòa giữa cơ sở dữ liệu quan hệ chặt chẽ trên Microsoft SQL Server và ứng dụng bán hàng POS hiện đại, tạo nên một giải pháp hoàn chỉnh, có tính ứng dụng thực tiễn cao cho các doanh nghiệp F&amp;B.</w:t>
+      </w:r>
+    </w:p>
+    <w:p>
+      <w:pPr>
+        <w:keepNext/>
+        <w:spacing w:before="360" w:after="160"/>
+      </w:pPr>
+      <w:r>
+        <w:rPr>
+          <w:rFonts w:ascii="Times New Roman" w:hAnsi="Times New Roman"/>
+          <w:b/>
+          <w:color w:val="78350F"/>
+          <w:sz w:val="30"/>
+        </w:rPr>
+        <w:t>TÀI LIỆU THAM KHẢO</w:t>
+      </w:r>
+    </w:p>
+    <w:p>
+      <w:pPr>
+        <w:pStyle w:val="ListBullet"/>
+        <w:spacing w:after="80" w:line="300" w:lineRule="auto"/>
+      </w:pPr>
+      <w:r>
+        <w:rPr>
+          <w:rFonts w:ascii="Times New Roman" w:hAnsi="Times New Roman"/>
+          <w:sz w:val="26"/>
+        </w:rPr>
+        <w:t>Trường Đại học Công nghệ Thông tin - ĐHQG TP.HCM, Đề cương môn học IE103 - Quản lý Thông tin.</w:t>
+      </w:r>
+    </w:p>
+    <w:p>
+      <w:pPr>
+        <w:pStyle w:val="ListBullet"/>
+        <w:spacing w:after="80" w:line="300" w:lineRule="auto"/>
+      </w:pPr>
+      <w:r>
+        <w:rPr>
+          <w:rFonts w:ascii="Times New Roman" w:hAnsi="Times New Roman"/>
+          <w:sz w:val="26"/>
+        </w:rPr>
+        <w:t>Microsoft Corporation, Transact-SQL Reference (Database Engine), Microsoft Learn Documentation.</w:t>
+      </w:r>
+    </w:p>
+    <w:p>
+      <w:pPr>
+        <w:pStyle w:val="ListBullet"/>
+        <w:spacing w:after="80" w:line="300" w:lineRule="auto"/>
+      </w:pPr>
+      <w:r>
+        <w:rPr>
+          <w:rFonts w:ascii="Times New Roman" w:hAnsi="Times New Roman"/>
+          <w:sz w:val="26"/>
+        </w:rPr>
+        <w:t>C. J. Date, An Introduction to Database Systems, 8th Edition, Addison-Wesley.</w:t>
+      </w:r>
+    </w:p>
+    <w:p>
+      <w:pPr>
+        <w:pStyle w:val="ListBullet"/>
+        <w:spacing w:after="80" w:line="300" w:lineRule="auto"/>
+      </w:pPr>
+      <w:r>
+        <w:rPr>
+          <w:rFonts w:ascii="Times New Roman" w:hAnsi="Times New Roman"/>
+          <w:sz w:val="26"/>
+        </w:rPr>
+        <w:t>Raghu Ramakrishnan, Johannes Gehrke, Database Management Systems, 3rd Edition, McGraw-Hill.</w:t>
       </w:r>
     </w:p>
     <w:sectPr>

</xml_diff>